<commit_message>
docs: detailed per-button descriptions (usage/when/action/result) — invoices sample + docx generator support
</commit_message>
<xml_diff>
--- a/docs/Business-OS-სისტემის-აღწერა.docx
+++ b/docs/Business-OS-სისტემის-აღწერა.docx
@@ -9847,6 +9847,1082 @@
         </w:tc>
       </w:tr>
     </w:tbl>
+    <w:p>
+      <w:r>
+        <w:rPr>
+          <w:rFonts w:ascii="Arial" w:hAnsi="Arial"/>
+          <w:b/>
+          <w:sz w:val="20"/>
+        </w:rPr>
+        <w:t>თითოეული ღილაკის დეტალური აღწერა:</w:t>
+      </w:r>
+    </w:p>
+    <w:p>
+      <w:r>
+        <w:rPr>
+          <w:b/>
+          <w:color w:val="105F7D"/>
+          <w:sz w:val="20"/>
+        </w:rPr>
+        <w:t>▸ შევსება</w:t>
+      </w:r>
+    </w:p>
+    <w:p>
+      <w:pPr>
+        <w:ind w:left="454"/>
+      </w:pPr>
+      <w:r>
+        <w:rPr>
+          <w:b/>
+          <w:sz w:val="19"/>
+        </w:rPr>
+        <w:t xml:space="preserve">რისთვის გამოიყენება: </w:t>
+      </w:r>
+      <w:r>
+        <w:rPr>
+          <w:sz w:val="19"/>
+        </w:rPr>
+        <w:t>ინვოისი, რომელიც ჯერ არ არის დადასტურებული (draft სტატუსით), უნდა შეივსოს და დასრულდეს. ეს ღილაკი ჩნდება მხოლოდ ასეთ ინვოისებზე სიაში.</w:t>
+      </w:r>
+    </w:p>
+    <w:p>
+      <w:pPr>
+        <w:ind w:left="454"/>
+      </w:pPr>
+      <w:r>
+        <w:rPr>
+          <w:b/>
+          <w:sz w:val="19"/>
+        </w:rPr>
+        <w:t xml:space="preserve">როდის ჩნდება: </w:t>
+      </w:r>
+      <w:r>
+        <w:rPr>
+          <w:sz w:val="19"/>
+        </w:rPr>
+        <w:t>სიაში, ინვოისის რიგზე, როცა ინვოისის სტატუსი არის „შესავსები" (draft).</w:t>
+      </w:r>
+    </w:p>
+    <w:p>
+      <w:pPr>
+        <w:ind w:left="454"/>
+      </w:pPr>
+      <w:r>
+        <w:rPr>
+          <w:b/>
+          <w:sz w:val="19"/>
+        </w:rPr>
+        <w:t xml:space="preserve">რას აკეთებს დაჭერისას: </w:t>
+      </w:r>
+      <w:r>
+        <w:rPr>
+          <w:sz w:val="19"/>
+        </w:rPr>
+        <w:t>ხსნის ინვოისს რედაქტირების რეჟიმში — ხედავთ პოზიციებს, ფასებს, ფასდაკლებებს და დღგ-ს.</w:t>
+      </w:r>
+    </w:p>
+    <w:p>
+      <w:pPr>
+        <w:ind w:left="454"/>
+      </w:pPr>
+      <w:r>
+        <w:rPr>
+          <w:b/>
+          <w:sz w:val="19"/>
+        </w:rPr>
+        <w:t xml:space="preserve">რა ხდება შემდეგ: </w:t>
+      </w:r>
+      <w:r>
+        <w:rPr>
+          <w:sz w:val="19"/>
+        </w:rPr>
+        <w:t>გადადიხართ ინვოისის რედაქტირების ეკრანზე, სადაც შეგიძლიათ შეცვალოთ მონაცემები და შემდეგ დაადასტუროთ ინვოისი.</w:t>
+      </w:r>
+    </w:p>
+    <w:p>
+      <w:r>
+        <w:rPr>
+          <w:b/>
+          <w:color w:val="105F7D"/>
+          <w:sz w:val="20"/>
+        </w:rPr>
+        <w:t>▸ PDF ნახვა</w:t>
+      </w:r>
+    </w:p>
+    <w:p>
+      <w:pPr>
+        <w:ind w:left="454"/>
+      </w:pPr>
+      <w:r>
+        <w:rPr>
+          <w:b/>
+          <w:sz w:val="19"/>
+        </w:rPr>
+        <w:t xml:space="preserve">რისთვის გამოიყენება: </w:t>
+      </w:r>
+      <w:r>
+        <w:rPr>
+          <w:sz w:val="19"/>
+        </w:rPr>
+        <w:t>ინვოისის ვიზუალური შემოწმება გაგზავნამდე — ზუსტად ისე ხედავთ დოკუმენტს, როგორც კლიენტი მიიღებს.</w:t>
+      </w:r>
+    </w:p>
+    <w:p>
+      <w:pPr>
+        <w:ind w:left="454"/>
+      </w:pPr>
+      <w:r>
+        <w:rPr>
+          <w:b/>
+          <w:sz w:val="19"/>
+        </w:rPr>
+        <w:t xml:space="preserve">როდის ჩნდება: </w:t>
+      </w:r>
+      <w:r>
+        <w:rPr>
+          <w:sz w:val="19"/>
+        </w:rPr>
+        <w:t>ინვოისის დეტალების ეკრანზე, ზედა მარჯვენა კუთხეში.</w:t>
+      </w:r>
+    </w:p>
+    <w:p>
+      <w:pPr>
+        <w:ind w:left="454"/>
+      </w:pPr>
+      <w:r>
+        <w:rPr>
+          <w:b/>
+          <w:sz w:val="19"/>
+        </w:rPr>
+        <w:t xml:space="preserve">რას აკეთებს დაჭერისას: </w:t>
+      </w:r>
+      <w:r>
+        <w:rPr>
+          <w:sz w:val="19"/>
+        </w:rPr>
+        <w:t>ქმნის ინვოისის PDF ვერსიას და აჩვენებს მას ეკრანზე (ჩაშენებული პრევიუ).</w:t>
+      </w:r>
+    </w:p>
+    <w:p>
+      <w:pPr>
+        <w:ind w:left="454"/>
+      </w:pPr>
+      <w:r>
+        <w:rPr>
+          <w:b/>
+          <w:sz w:val="19"/>
+        </w:rPr>
+        <w:t xml:space="preserve">რა ხდება შემდეგ: </w:t>
+      </w:r>
+      <w:r>
+        <w:rPr>
+          <w:sz w:val="19"/>
+        </w:rPr>
+        <w:t>ეკრანზე ჩნდება ინვოისის PDF პრევიუ — შეგიძლიათ შეამოწმოთ გარეგნობა, ნომრები და თანხები.</w:t>
+      </w:r>
+    </w:p>
+    <w:p>
+      <w:r>
+        <w:rPr>
+          <w:b/>
+          <w:color w:val="105F7D"/>
+          <w:sz w:val="20"/>
+        </w:rPr>
+        <w:t>▸ რედაქტირების გაგრძელება</w:t>
+      </w:r>
+    </w:p>
+    <w:p>
+      <w:pPr>
+        <w:ind w:left="454"/>
+      </w:pPr>
+      <w:r>
+        <w:rPr>
+          <w:b/>
+          <w:sz w:val="19"/>
+        </w:rPr>
+        <w:t xml:space="preserve">რისთვის გამოიყენება: </w:t>
+      </w:r>
+      <w:r>
+        <w:rPr>
+          <w:sz w:val="19"/>
+        </w:rPr>
+        <w:t>დაუმთავრებელი ინვოისის ჩასწორება — მაგალითად, დაგავიწყდათ პოზიციის დამატება ან ფასის შეცვლა.</w:t>
+      </w:r>
+    </w:p>
+    <w:p>
+      <w:pPr>
+        <w:ind w:left="454"/>
+      </w:pPr>
+      <w:r>
+        <w:rPr>
+          <w:b/>
+          <w:sz w:val="19"/>
+        </w:rPr>
+        <w:t xml:space="preserve">როდის ჩნდება: </w:t>
+      </w:r>
+      <w:r>
+        <w:rPr>
+          <w:sz w:val="19"/>
+        </w:rPr>
+        <w:t>ინვოისის დეტალებზე, როცა ინვოისი ჯერ კიდევ draft სტატუსშია.</w:t>
+      </w:r>
+    </w:p>
+    <w:p>
+      <w:pPr>
+        <w:ind w:left="454"/>
+      </w:pPr>
+      <w:r>
+        <w:rPr>
+          <w:b/>
+          <w:sz w:val="19"/>
+        </w:rPr>
+        <w:t xml:space="preserve">რას აკეთებს დაჭერისას: </w:t>
+      </w:r>
+      <w:r>
+        <w:rPr>
+          <w:sz w:val="19"/>
+        </w:rPr>
+        <w:t>ხსნის ინვოისს რედაქტირების რეჟიმში, სადაც ყველა ველი ჩასაწორებელია.</w:t>
+      </w:r>
+    </w:p>
+    <w:p>
+      <w:pPr>
+        <w:ind w:left="454"/>
+      </w:pPr>
+      <w:r>
+        <w:rPr>
+          <w:b/>
+          <w:sz w:val="19"/>
+        </w:rPr>
+        <w:t xml:space="preserve">რა ხდება შემდეგ: </w:t>
+      </w:r>
+      <w:r>
+        <w:rPr>
+          <w:sz w:val="19"/>
+        </w:rPr>
+        <w:t>გადადიხართ რედაქტირების ეკრანზე — ცვლილებების შენახვა შესაძლებელია ნებისმიერ დროს.</w:t>
+      </w:r>
+    </w:p>
+    <w:p>
+      <w:r>
+        <w:rPr>
+          <w:b/>
+          <w:color w:val="105F7D"/>
+          <w:sz w:val="20"/>
+        </w:rPr>
+        <w:t>▸ PDF ჩამოტვირთვა</w:t>
+      </w:r>
+    </w:p>
+    <w:p>
+      <w:pPr>
+        <w:ind w:left="454"/>
+      </w:pPr>
+      <w:r>
+        <w:rPr>
+          <w:b/>
+          <w:sz w:val="19"/>
+        </w:rPr>
+        <w:t xml:space="preserve">რისთვის გამოიყენება: </w:t>
+      </w:r>
+      <w:r>
+        <w:rPr>
+          <w:sz w:val="19"/>
+        </w:rPr>
+        <w:t>ინვოისის ფაილის შენახვა კომპიუტერში — გასაგზავნად ელ.ფოსტით ან დასაბეჭდად.</w:t>
+      </w:r>
+    </w:p>
+    <w:p>
+      <w:pPr>
+        <w:ind w:left="454"/>
+      </w:pPr>
+      <w:r>
+        <w:rPr>
+          <w:b/>
+          <w:sz w:val="19"/>
+        </w:rPr>
+        <w:t xml:space="preserve">როდის ჩნდება: </w:t>
+      </w:r>
+      <w:r>
+        <w:rPr>
+          <w:sz w:val="19"/>
+        </w:rPr>
+        <w:t>დადასტურებული ინვოისის დეტალებზე, მწვანე ბლოკში „დადასტურებული დოკუმენტი".</w:t>
+      </w:r>
+    </w:p>
+    <w:p>
+      <w:pPr>
+        <w:ind w:left="454"/>
+      </w:pPr>
+      <w:r>
+        <w:rPr>
+          <w:b/>
+          <w:sz w:val="19"/>
+        </w:rPr>
+        <w:t xml:space="preserve">რას აკეთებს დაჭერისას: </w:t>
+      </w:r>
+      <w:r>
+        <w:rPr>
+          <w:sz w:val="19"/>
+        </w:rPr>
+        <w:t>ქმნის PDF ფაილს და იწყებს მის ჩამოტვირთვას.</w:t>
+      </w:r>
+    </w:p>
+    <w:p>
+      <w:pPr>
+        <w:ind w:left="454"/>
+      </w:pPr>
+      <w:r>
+        <w:rPr>
+          <w:b/>
+          <w:sz w:val="19"/>
+        </w:rPr>
+        <w:t xml:space="preserve">რა ხდება შემდეგ: </w:t>
+      </w:r>
+      <w:r>
+        <w:rPr>
+          <w:sz w:val="19"/>
+        </w:rPr>
+        <w:t>კომპიუტერში ინახება ინვოისის PDF ფაილი, რომელიც შეგიძლიათ კლიენტს გაუგზავნოთ.</w:t>
+      </w:r>
+    </w:p>
+    <w:p>
+      <w:r>
+        <w:rPr>
+          <w:b/>
+          <w:color w:val="105F7D"/>
+          <w:sz w:val="20"/>
+        </w:rPr>
+        <w:t>▸ Word ჩამოტვირთვა</w:t>
+      </w:r>
+    </w:p>
+    <w:p>
+      <w:pPr>
+        <w:ind w:left="454"/>
+      </w:pPr>
+      <w:r>
+        <w:rPr>
+          <w:b/>
+          <w:sz w:val="19"/>
+        </w:rPr>
+        <w:t xml:space="preserve">რისთვის გამოიყენება: </w:t>
+      </w:r>
+      <w:r>
+        <w:rPr>
+          <w:sz w:val="19"/>
+        </w:rPr>
+        <w:t>ინვოისის Word ფორმატში მიღება — თუ გჭირდებათ დოკუმენტის ჩასწორება Word-ში ან სხვა ფორმატში გადაყვანა.</w:t>
+      </w:r>
+    </w:p>
+    <w:p>
+      <w:pPr>
+        <w:ind w:left="454"/>
+      </w:pPr>
+      <w:r>
+        <w:rPr>
+          <w:b/>
+          <w:sz w:val="19"/>
+        </w:rPr>
+        <w:t xml:space="preserve">როდის ჩნდება: </w:t>
+      </w:r>
+      <w:r>
+        <w:rPr>
+          <w:sz w:val="19"/>
+        </w:rPr>
+        <w:t>დადასტურებული ინვოისის დეტალებზე, „PDF ჩამოტვირთვის" გვერდით.</w:t>
+      </w:r>
+    </w:p>
+    <w:p>
+      <w:pPr>
+        <w:ind w:left="454"/>
+      </w:pPr>
+      <w:r>
+        <w:rPr>
+          <w:b/>
+          <w:sz w:val="19"/>
+        </w:rPr>
+        <w:t xml:space="preserve">რას აკეთებს დაჭერისას: </w:t>
+      </w:r>
+      <w:r>
+        <w:rPr>
+          <w:sz w:val="19"/>
+        </w:rPr>
+        <w:t>ქმნის Word ფაილს და იწყებს ჩამოტვირთვას.</w:t>
+      </w:r>
+    </w:p>
+    <w:p>
+      <w:pPr>
+        <w:ind w:left="454"/>
+      </w:pPr>
+      <w:r>
+        <w:rPr>
+          <w:b/>
+          <w:sz w:val="19"/>
+        </w:rPr>
+        <w:t xml:space="preserve">რა ხდება შემდეგ: </w:t>
+      </w:r>
+      <w:r>
+        <w:rPr>
+          <w:sz w:val="19"/>
+        </w:rPr>
+        <w:t>კომპიუტერში ინახება ინვოისის Word ვერსია.</w:t>
+      </w:r>
+    </w:p>
+    <w:p>
+      <w:r>
+        <w:rPr>
+          <w:b/>
+          <w:color w:val="105F7D"/>
+          <w:sz w:val="20"/>
+        </w:rPr>
+        <w:t>▸ Excel ჩამოტვირთვა</w:t>
+      </w:r>
+    </w:p>
+    <w:p>
+      <w:pPr>
+        <w:ind w:left="454"/>
+      </w:pPr>
+      <w:r>
+        <w:rPr>
+          <w:b/>
+          <w:sz w:val="19"/>
+        </w:rPr>
+        <w:t xml:space="preserve">რისთვის გამოიყენება: </w:t>
+      </w:r>
+      <w:r>
+        <w:rPr>
+          <w:sz w:val="19"/>
+        </w:rPr>
+        <w:t>ინვოისის მონაცემების Excel ფორმატში მიღება — სტატისტიკისთვის, ანალიზისთვის ან ბუღალტრული აღრიცხვისთვის.</w:t>
+      </w:r>
+    </w:p>
+    <w:p>
+      <w:pPr>
+        <w:ind w:left="454"/>
+      </w:pPr>
+      <w:r>
+        <w:rPr>
+          <w:b/>
+          <w:sz w:val="19"/>
+        </w:rPr>
+        <w:t xml:space="preserve">როდის ჩნდება: </w:t>
+      </w:r>
+      <w:r>
+        <w:rPr>
+          <w:sz w:val="19"/>
+        </w:rPr>
+        <w:t>დადასტურებული ინვოისის დეტალებზე.</w:t>
+      </w:r>
+    </w:p>
+    <w:p>
+      <w:pPr>
+        <w:ind w:left="454"/>
+      </w:pPr>
+      <w:r>
+        <w:rPr>
+          <w:b/>
+          <w:sz w:val="19"/>
+        </w:rPr>
+        <w:t xml:space="preserve">რას აკეთებს დაჭერისას: </w:t>
+      </w:r>
+      <w:r>
+        <w:rPr>
+          <w:sz w:val="19"/>
+        </w:rPr>
+        <w:t>ქმნის Excel ფაილს ინვოისის მონაცემებით და იწყებს ჩამოტვირთვას.</w:t>
+      </w:r>
+    </w:p>
+    <w:p>
+      <w:pPr>
+        <w:ind w:left="454"/>
+      </w:pPr>
+      <w:r>
+        <w:rPr>
+          <w:b/>
+          <w:sz w:val="19"/>
+        </w:rPr>
+        <w:t xml:space="preserve">რა ხდება შემდეგ: </w:t>
+      </w:r>
+      <w:r>
+        <w:rPr>
+          <w:sz w:val="19"/>
+        </w:rPr>
+        <w:t>კომპიუტერში ინახება ინვოისის Excel ვერსია — ცხრილის სახით.</w:t>
+      </w:r>
+    </w:p>
+    <w:p>
+      <w:r>
+        <w:rPr>
+          <w:b/>
+          <w:color w:val="105F7D"/>
+          <w:sz w:val="20"/>
+        </w:rPr>
+        <w:t>▸ დამატება</w:t>
+      </w:r>
+    </w:p>
+    <w:p>
+      <w:pPr>
+        <w:ind w:left="454"/>
+      </w:pPr>
+      <w:r>
+        <w:rPr>
+          <w:b/>
+          <w:sz w:val="19"/>
+        </w:rPr>
+        <w:t xml:space="preserve">რისთვის გამოიყენება: </w:t>
+      </w:r>
+      <w:r>
+        <w:rPr>
+          <w:sz w:val="19"/>
+        </w:rPr>
+        <w:t>ინვოისში ახალი პოზიციის (პროდუქტის/მომსახურების) დამატება — მაგალითად, თუ კლიენტმა დამატებითი პროდუქტი შეიძინა.</w:t>
+      </w:r>
+    </w:p>
+    <w:p>
+      <w:pPr>
+        <w:ind w:left="454"/>
+      </w:pPr>
+      <w:r>
+        <w:rPr>
+          <w:b/>
+          <w:sz w:val="19"/>
+        </w:rPr>
+        <w:t xml:space="preserve">როდის ჩნდება: </w:t>
+      </w:r>
+      <w:r>
+        <w:rPr>
+          <w:sz w:val="19"/>
+        </w:rPr>
+        <w:t>ინვოისის რედაქტირების ეკრანზე, სექციაში „3. პოზიციები".</w:t>
+      </w:r>
+    </w:p>
+    <w:p>
+      <w:pPr>
+        <w:ind w:left="454"/>
+      </w:pPr>
+      <w:r>
+        <w:rPr>
+          <w:b/>
+          <w:sz w:val="19"/>
+        </w:rPr>
+        <w:t xml:space="preserve">რას აკეთებს დაჭერისას: </w:t>
+      </w:r>
+      <w:r>
+        <w:rPr>
+          <w:sz w:val="19"/>
+        </w:rPr>
+        <w:t>ამატებს ახალ ცარიელ სტრიქონს პოზიციების სიაში.</w:t>
+      </w:r>
+    </w:p>
+    <w:p>
+      <w:pPr>
+        <w:ind w:left="454"/>
+      </w:pPr>
+      <w:r>
+        <w:rPr>
+          <w:b/>
+          <w:sz w:val="19"/>
+        </w:rPr>
+        <w:t xml:space="preserve">რა ხდება შემდეგ: </w:t>
+      </w:r>
+      <w:r>
+        <w:rPr>
+          <w:sz w:val="19"/>
+        </w:rPr>
+        <w:t>ჩნდება ახალი სტრიქონი, სადაც შეიყვანთ დასახელებას, რაოდენობას, ფასს, ფასდაკლებას და დღგ-ს.</w:t>
+      </w:r>
+    </w:p>
+    <w:p>
+      <w:r>
+        <w:rPr>
+          <w:b/>
+          <w:color w:val="105F7D"/>
+          <w:sz w:val="20"/>
+        </w:rPr>
+        <w:t>▸ ცვლილებების შენახვა</w:t>
+      </w:r>
+    </w:p>
+    <w:p>
+      <w:pPr>
+        <w:ind w:left="454"/>
+      </w:pPr>
+      <w:r>
+        <w:rPr>
+          <w:b/>
+          <w:sz w:val="19"/>
+        </w:rPr>
+        <w:t xml:space="preserve">რისთვის გამოიყენება: </w:t>
+      </w:r>
+      <w:r>
+        <w:rPr>
+          <w:sz w:val="19"/>
+        </w:rPr>
+        <w:t>ინვოისში შეტანილი ცვლილებების დაფიქსირება — რომ არ დაიკარგოს ნამუშევარი და ინვოისი შენარჩუნდეს draft სტატუსით.</w:t>
+      </w:r>
+    </w:p>
+    <w:p>
+      <w:pPr>
+        <w:ind w:left="454"/>
+      </w:pPr>
+      <w:r>
+        <w:rPr>
+          <w:b/>
+          <w:sz w:val="19"/>
+        </w:rPr>
+        <w:t xml:space="preserve">როდის ჩნდება: </w:t>
+      </w:r>
+      <w:r>
+        <w:rPr>
+          <w:sz w:val="19"/>
+        </w:rPr>
+        <w:t>ინვოისის რედაქტირების ეკრანზე, ქვედა ნაწილში.</w:t>
+      </w:r>
+    </w:p>
+    <w:p>
+      <w:pPr>
+        <w:ind w:left="454"/>
+      </w:pPr>
+      <w:r>
+        <w:rPr>
+          <w:b/>
+          <w:sz w:val="19"/>
+        </w:rPr>
+        <w:t xml:space="preserve">რას აკეთებს დაჭერისას: </w:t>
+      </w:r>
+      <w:r>
+        <w:rPr>
+          <w:sz w:val="19"/>
+        </w:rPr>
+        <w:t>ინახავს ყველა ცვლილებას სისტემაში, ინვოისი რჩება draft სტატუსით.</w:t>
+      </w:r>
+    </w:p>
+    <w:p>
+      <w:pPr>
+        <w:ind w:left="454"/>
+      </w:pPr>
+      <w:r>
+        <w:rPr>
+          <w:b/>
+          <w:sz w:val="19"/>
+        </w:rPr>
+        <w:t xml:space="preserve">რა ხდება შემდეგ: </w:t>
+      </w:r>
+      <w:r>
+        <w:rPr>
+          <w:sz w:val="19"/>
+        </w:rPr>
+        <w:t>ცვლილებები შენახულია — შეგიძლიათ მოგვიანებით გააგრძელოთ რედაქტირება.</w:t>
+      </w:r>
+    </w:p>
+    <w:p>
+      <w:r>
+        <w:rPr>
+          <w:b/>
+          <w:color w:val="105F7D"/>
+          <w:sz w:val="20"/>
+        </w:rPr>
+        <w:t>▸ შენახვა და PDF ნახვა</w:t>
+      </w:r>
+    </w:p>
+    <w:p>
+      <w:pPr>
+        <w:ind w:left="454"/>
+      </w:pPr>
+      <w:r>
+        <w:rPr>
+          <w:b/>
+          <w:sz w:val="19"/>
+        </w:rPr>
+        <w:t xml:space="preserve">რისთვის გამოიყენება: </w:t>
+      </w:r>
+      <w:r>
+        <w:rPr>
+          <w:sz w:val="19"/>
+        </w:rPr>
+        <w:t>ინვოისის შენახვა და მაშინვე ვიზუალური შემოწმება — ერთი ნაბიჯით ორი მოქმედება.</w:t>
+      </w:r>
+    </w:p>
+    <w:p>
+      <w:pPr>
+        <w:ind w:left="454"/>
+      </w:pPr>
+      <w:r>
+        <w:rPr>
+          <w:b/>
+          <w:sz w:val="19"/>
+        </w:rPr>
+        <w:t xml:space="preserve">როდის ჩნდება: </w:t>
+      </w:r>
+      <w:r>
+        <w:rPr>
+          <w:sz w:val="19"/>
+        </w:rPr>
+        <w:t>ინვოისის რედაქტირების ეკრანზე.</w:t>
+      </w:r>
+    </w:p>
+    <w:p>
+      <w:pPr>
+        <w:ind w:left="454"/>
+      </w:pPr>
+      <w:r>
+        <w:rPr>
+          <w:b/>
+          <w:sz w:val="19"/>
+        </w:rPr>
+        <w:t xml:space="preserve">რას აკეთებს დაჭერისას: </w:t>
+      </w:r>
+      <w:r>
+        <w:rPr>
+          <w:sz w:val="19"/>
+        </w:rPr>
+        <w:t>ინახავს ცვლილებებს და შემდეგ აჩვენებს ინვოისის PDF პრევიუს.</w:t>
+      </w:r>
+    </w:p>
+    <w:p>
+      <w:pPr>
+        <w:ind w:left="454"/>
+      </w:pPr>
+      <w:r>
+        <w:rPr>
+          <w:b/>
+          <w:sz w:val="19"/>
+        </w:rPr>
+        <w:t xml:space="preserve">რა ხდება შემდეგ: </w:t>
+      </w:r>
+      <w:r>
+        <w:rPr>
+          <w:sz w:val="19"/>
+        </w:rPr>
+        <w:t>ცვლილებები შენახულია და ეკრანზე ჩანს ინვოისის PDF — შეგიძლიათ შეამოწმოთ გარეგნობა.</w:t>
+      </w:r>
+    </w:p>
+    <w:p>
+      <w:r>
+        <w:rPr>
+          <w:b/>
+          <w:color w:val="105F7D"/>
+          <w:sz w:val="20"/>
+        </w:rPr>
+        <w:t>▸ დადასტურებაზე გადასვლა</w:t>
+      </w:r>
+    </w:p>
+    <w:p>
+      <w:pPr>
+        <w:ind w:left="454"/>
+      </w:pPr>
+      <w:r>
+        <w:rPr>
+          <w:b/>
+          <w:sz w:val="19"/>
+        </w:rPr>
+        <w:t xml:space="preserve">რისთვის გამოიყენება: </w:t>
+      </w:r>
+      <w:r>
+        <w:rPr>
+          <w:sz w:val="19"/>
+        </w:rPr>
+        <w:t>ინვოისის საბოლოო დადასტურების დაწყება — ეს არის ბოლო ნაბიჯი, რის შემდეგაც ინვოისი ოფიციალური ხდება.</w:t>
+      </w:r>
+    </w:p>
+    <w:p>
+      <w:pPr>
+        <w:ind w:left="454"/>
+      </w:pPr>
+      <w:r>
+        <w:rPr>
+          <w:b/>
+          <w:sz w:val="19"/>
+        </w:rPr>
+        <w:t xml:space="preserve">როდის ჩნდება: </w:t>
+      </w:r>
+      <w:r>
+        <w:rPr>
+          <w:sz w:val="19"/>
+        </w:rPr>
+        <w:t>ინვოისის რედაქტირების ეკრანზე, როცა ყველა პოზიცია შევსებულია.</w:t>
+      </w:r>
+    </w:p>
+    <w:p>
+      <w:pPr>
+        <w:ind w:left="454"/>
+      </w:pPr>
+      <w:r>
+        <w:rPr>
+          <w:b/>
+          <w:sz w:val="19"/>
+        </w:rPr>
+        <w:t xml:space="preserve">რას აკეთებს დაჭერისას: </w:t>
+      </w:r>
+      <w:r>
+        <w:rPr>
+          <w:sz w:val="19"/>
+        </w:rPr>
+        <w:t>ხსნის დადასტურების დიალოგს გაფრთხილებით, რომ დადასტურების შემდეგ მონაცემები დაიკეტება.</w:t>
+      </w:r>
+    </w:p>
+    <w:p>
+      <w:pPr>
+        <w:ind w:left="454"/>
+      </w:pPr>
+      <w:r>
+        <w:rPr>
+          <w:b/>
+          <w:sz w:val="19"/>
+        </w:rPr>
+        <w:t xml:space="preserve">რა ხდება შემდეგ: </w:t>
+      </w:r>
+      <w:r>
+        <w:rPr>
+          <w:sz w:val="19"/>
+        </w:rPr>
+        <w:t>ჩნდება დიალოგი: „დიახ, დაადასტურე" ან „უკან დაბრუნება".</w:t>
+      </w:r>
+    </w:p>
+    <w:p>
+      <w:r>
+        <w:rPr>
+          <w:b/>
+          <w:color w:val="105F7D"/>
+          <w:sz w:val="20"/>
+        </w:rPr>
+        <w:t>▸ დიახ, დაადასტურე</w:t>
+      </w:r>
+    </w:p>
+    <w:p>
+      <w:pPr>
+        <w:ind w:left="454"/>
+      </w:pPr>
+      <w:r>
+        <w:rPr>
+          <w:b/>
+          <w:sz w:val="19"/>
+        </w:rPr>
+        <w:t xml:space="preserve">რისთვის გამოიყენება: </w:t>
+      </w:r>
+      <w:r>
+        <w:rPr>
+          <w:sz w:val="19"/>
+        </w:rPr>
+        <w:t>ინვოისის საბოლოო დადასტურება — ამ მომენტიდან ინვოისი ოფიციალური დოკუმენტია და მისი ჩასწორება შეუძლებელია.</w:t>
+      </w:r>
+    </w:p>
+    <w:p>
+      <w:pPr>
+        <w:ind w:left="454"/>
+      </w:pPr>
+      <w:r>
+        <w:rPr>
+          <w:b/>
+          <w:sz w:val="19"/>
+        </w:rPr>
+        <w:t xml:space="preserve">როდის ჩნდება: </w:t>
+      </w:r>
+      <w:r>
+        <w:rPr>
+          <w:sz w:val="19"/>
+        </w:rPr>
+        <w:t>დადასტურების დიალოგში, მას შემდეგ რაც დააჭერთ „დადასტურებაზე გადასვლას".</w:t>
+      </w:r>
+    </w:p>
+    <w:p>
+      <w:pPr>
+        <w:ind w:left="454"/>
+      </w:pPr>
+      <w:r>
+        <w:rPr>
+          <w:b/>
+          <w:sz w:val="19"/>
+        </w:rPr>
+        <w:t xml:space="preserve">რას აკეთებს დაჭერისას: </w:t>
+      </w:r>
+      <w:r>
+        <w:rPr>
+          <w:sz w:val="19"/>
+        </w:rPr>
+        <w:t>ადასტურებს ინვოისს: იქმნება კლიენტის დავალიანება და ბუღალტრული გატარება.</w:t>
+      </w:r>
+    </w:p>
+    <w:p>
+      <w:pPr>
+        <w:ind w:left="454"/>
+      </w:pPr>
+      <w:r>
+        <w:rPr>
+          <w:b/>
+          <w:sz w:val="19"/>
+        </w:rPr>
+        <w:t xml:space="preserve">რა ხდება შემდეგ: </w:t>
+      </w:r>
+      <w:r>
+        <w:rPr>
+          <w:sz w:val="19"/>
+        </w:rPr>
+        <w:t>ინვოისი ხდება „დადასტურებული" — კლიენტს უჩნდება დავალიანება, მონაცემები იკეტება და ხელმისაწვდომი ხდება ჩამოტვირთვა.</w:t>
+      </w:r>
+    </w:p>
+    <w:p>
+      <w:r>
+        <w:rPr>
+          <w:b/>
+          <w:color w:val="105F7D"/>
+          <w:sz w:val="20"/>
+        </w:rPr>
+        <w:t>▸ უკან დაბრუნება</w:t>
+      </w:r>
+    </w:p>
+    <w:p>
+      <w:pPr>
+        <w:ind w:left="454"/>
+      </w:pPr>
+      <w:r>
+        <w:rPr>
+          <w:b/>
+          <w:sz w:val="19"/>
+        </w:rPr>
+        <w:t xml:space="preserve">რისთვის გამოიყენება: </w:t>
+      </w:r>
+      <w:r>
+        <w:rPr>
+          <w:sz w:val="19"/>
+        </w:rPr>
+        <w:t>დადასტურების დიალოგის დახურვა — თუ გადაიფიქრეთ ან კიდევ რაღაცის შეცვლა გინდათ.</w:t>
+      </w:r>
+    </w:p>
+    <w:p>
+      <w:pPr>
+        <w:ind w:left="454"/>
+      </w:pPr>
+      <w:r>
+        <w:rPr>
+          <w:b/>
+          <w:sz w:val="19"/>
+        </w:rPr>
+        <w:t xml:space="preserve">როდის ჩნდება: </w:t>
+      </w:r>
+      <w:r>
+        <w:rPr>
+          <w:sz w:val="19"/>
+        </w:rPr>
+        <w:t>დადასტურების დიალოგში.</w:t>
+      </w:r>
+    </w:p>
+    <w:p>
+      <w:pPr>
+        <w:ind w:left="454"/>
+      </w:pPr>
+      <w:r>
+        <w:rPr>
+          <w:b/>
+          <w:sz w:val="19"/>
+        </w:rPr>
+        <w:t xml:space="preserve">რას აკეთებს დაჭერისას: </w:t>
+      </w:r>
+      <w:r>
+        <w:rPr>
+          <w:sz w:val="19"/>
+        </w:rPr>
+        <w:t>ხურავს დიალოგს და აბრუნებს რედაქტირების ეკრანზე.</w:t>
+      </w:r>
+    </w:p>
+    <w:p>
+      <w:pPr>
+        <w:ind w:left="454"/>
+      </w:pPr>
+      <w:r>
+        <w:rPr>
+          <w:b/>
+          <w:sz w:val="19"/>
+        </w:rPr>
+        <w:t xml:space="preserve">რა ხდება შემდეგ: </w:t>
+      </w:r>
+      <w:r>
+        <w:rPr>
+          <w:sz w:val="19"/>
+        </w:rPr>
+        <w:t>ინვოისი რჩება draft სტატუსით — შეგიძლიათ გააგრძელოთ ჩასწორება.</w:t>
+      </w:r>
+    </w:p>
+    <w:p>
+      <w:r>
+        <w:rPr>
+          <w:b/>
+          <w:color w:val="105F7D"/>
+          <w:sz w:val="20"/>
+        </w:rPr>
+        <w:t>▸ სრულ ეკრანზე / ბეჭდვა</w:t>
+      </w:r>
+    </w:p>
+    <w:p>
+      <w:pPr>
+        <w:ind w:left="454"/>
+      </w:pPr>
+      <w:r>
+        <w:rPr>
+          <w:b/>
+          <w:sz w:val="19"/>
+        </w:rPr>
+        <w:t xml:space="preserve">რისთვის გამოიყენება: </w:t>
+      </w:r>
+      <w:r>
+        <w:rPr>
+          <w:sz w:val="19"/>
+        </w:rPr>
+        <w:t>ინვოისის სრულ ეკრანზე ნახვა ან დაბეჭდვა — მაგალითად, თუ გსურთ ქაღალდზე ამობეჭდვა კლიენტისთვის.</w:t>
+      </w:r>
+    </w:p>
+    <w:p>
+      <w:pPr>
+        <w:ind w:left="454"/>
+      </w:pPr>
+      <w:r>
+        <w:rPr>
+          <w:b/>
+          <w:sz w:val="19"/>
+        </w:rPr>
+        <w:t xml:space="preserve">როდის ჩნდება: </w:t>
+      </w:r>
+      <w:r>
+        <w:rPr>
+          <w:sz w:val="19"/>
+        </w:rPr>
+        <w:t>PDF პრევიუს ქვეშ, როცა ინვოისის პრევიუ ეკრანზეა.</w:t>
+      </w:r>
+    </w:p>
+    <w:p>
+      <w:pPr>
+        <w:ind w:left="454"/>
+      </w:pPr>
+      <w:r>
+        <w:rPr>
+          <w:b/>
+          <w:sz w:val="19"/>
+        </w:rPr>
+        <w:t xml:space="preserve">რას აკეთებს დაჭერისას: </w:t>
+      </w:r>
+      <w:r>
+        <w:rPr>
+          <w:sz w:val="19"/>
+        </w:rPr>
+        <w:t>ხსნის PDF-ს ახალ ტაბში ბრაუზერში.</w:t>
+      </w:r>
+    </w:p>
+    <w:p>
+      <w:pPr>
+        <w:ind w:left="454"/>
+      </w:pPr>
+      <w:r>
+        <w:rPr>
+          <w:b/>
+          <w:sz w:val="19"/>
+        </w:rPr>
+        <w:t xml:space="preserve">რა ხდება შემდეგ: </w:t>
+      </w:r>
+      <w:r>
+        <w:rPr>
+          <w:sz w:val="19"/>
+        </w:rPr>
+        <w:t>ინვოისი იხსნება სრულ ეკრანზე — ბრაუზერის ბეჭდვის ფუნქციით შეგიძლიათ ამობეჭდოთ.</w:t>
+      </w:r>
+    </w:p>
     <w:p>
       <w:pPr>
         <w:pStyle w:val="Heading2"/>

</xml_diff>